<commit_message>
Expand final B paper and appendix guidance
</commit_message>
<xml_diff>
--- a/docs/B题论文终稿.docx
+++ b/docs/B题论文终稿.docx
@@ -63,7 +63,7 @@
           <w:rFonts w:ascii="Times New Roman" w:hAnsi="Times New Roman" w:eastAsia="宋体"/>
           <w:sz w:val="22"/>
         </w:rPr>
-        <w:t>针对“浙超”联赛 64 支队伍的小组分组、抽签公平性、比赛地点选择及赛制优化问题，本文构建了一套“分组生成—公平抽签—赛点配置—赛制优化”的一体化决策模型。对于问题 1，本文将题目要求拆解为硬约束与软约束，建立 16 个小组、每组 4 支队伍的组合优化模型，并设计随机启发式算法，在 500 次搜索中得到 450 个可行方案。最优方案的同市县级队同组冲突对数为 0，平均城市来源熵为 2.0000，各组总实力标准差为 6.2099。对于问题 2，本文提出分阶段等概率抽签流程，并通过 10000 次蒙特卡洛模拟进行公平性检验；结果表明平均卡方检验 p 值为 0.5418，无队伍出现显著偏差。对于问题 3，本文建立熵权多目标离散设施选址模型，推荐三门县、诸暨市、仙居县、丽水市、义乌市、东阳市、磐安县和金华市 8 个赛点，平均分配距离为 127.83 km，最大距离为 214.82 km。对于问题 4，本文利用熵权合成的实力代理值与带疲劳项的比赛仿真模型，对 7 类赛制进行了 20000 次蒙特卡洛比较。结果显示，seeded_reseeded 方案在优先级加权 TOPSIS 下得分最高，为 0.822888。</w:t>
+        <w:t>针对“浙超”联赛 64 支队伍的小组分组、抽签公平性、比赛地点选择及赛制优化问题，本文构建了一套“分组生成—公平抽签—赛点配置—赛制优化”的一体化建模框架，并将题目四问统一为一条可复现、可解释、可扩展的决策链。问题 1 中，本文建立带硬约束与软约束的组合优化模型，并设计“市级队先随机落位、县级队按约束紧度逐步安置”的随机启发式算法，在 500 次搜索中得到 450 个可行方案；最优方案实现同市县级队同组冲突对数为 0、平均城市来源熵为 2.0000、各组总实力标准差为 6.2099。问题 2 中，本文提出分阶段等概率抽签流程，并通过 10000 次蒙特卡洛模拟和卡方检验验证其公平性，结果显示平均 p 值为 0.5418，无队伍出现显著偏差。问题 3 中，本文基于浙江省 64 个参赛地区的人口、GDP、交通、体育基础、铁路与机场可达性等数据，建立熵权多目标离散设施选址模型，推荐三门县、诸暨市、仙居县、丽水市、义乌市、东阳市、磐安县和金华市 8 个赛点，平均分配距离为 127.83 km，最大距离为 214.82 km。问题 4 中，本文利用熵权合成的实力代理值与带疲劳项的比赛仿真模型，对 7 类赛制进行了 20000 次蒙特卡洛比较。结果表明，seeded_reseeded 方案在优先级加权 TOPSIS 下得分最高，为 0.822888；相较于当前随机赛制，该方案将前 4 强队在 32 强首轮出局概率由 0.2831 降至 0.2551，并将前 8 强队进入八强的概率由 0.3817 提高到 0.3968。进一步地，本文从分组多方案比较、抽签统计公平性、赛点多目标权衡和赛制疲劳传递建模四个方面对模型进行了系统改进，并通过敏感性分析验证了主要结论的稳健性。</w:t>
       </w:r>
     </w:p>
     <w:p>
@@ -124,7 +124,20 @@
           <w:rFonts w:ascii="Times New Roman" w:hAnsi="Times New Roman" w:eastAsia="黑体"/>
           <w:sz w:val="28"/>
         </w:rPr>
-        <w:t>2 模型假设</w:t>
+        <w:t>2 问题分析与模型假设</w:t>
+      </w:r>
+    </w:p>
+    <w:p>
+      <w:pPr>
+        <w:spacing w:line="360" w:lineRule="auto"/>
+        <w:ind w:firstLine="420"/>
+      </w:pPr>
+      <w:r>
+        <w:rPr>
+          <w:rFonts w:ascii="Times New Roman" w:hAnsi="Times New Roman" w:eastAsia="宋体"/>
+          <w:sz w:val="22"/>
+        </w:rPr>
+        <w:t>问题 1 属于带硬约束与软约束的组合优化问题，问题 2 属于带约束的随机公平性问题，问题 3 属于多目标离散设施选址问题，问题 4 属于基于蒙特卡洛仿真的赛制评价问题。</w:t>
       </w:r>
     </w:p>
     <w:p>
@@ -163,7 +176,7 @@
           <w:rFonts w:ascii="Times New Roman" w:hAnsi="Times New Roman" w:eastAsia="宋体"/>
           <w:sz w:val="22"/>
         </w:rPr>
-        <w:t>当缺乏完整历史战绩时，用地区综合指标构造球队实力代理值。</w:t>
+        <w:t>缺乏完整历史战绩时，用地区综合指标构造球队实力代理值。</w:t>
       </w:r>
     </w:p>
     <w:p>
@@ -214,7 +227,7 @@
           <w:rFonts w:ascii="Times New Roman" w:hAnsi="Times New Roman" w:eastAsia="宋体"/>
           <w:sz w:val="22"/>
         </w:rPr>
-        <w:t>本文采用“市级队先随机落位、县级队按约束紧度逐步放置”的随机启发式算法。程序共搜索 500 次，得到 450 个可行方案。最优方案不仅完全满足全部硬约束，而且在县级队分散性和小组实力均衡性方面表现良好。</w:t>
+        <w:t>本文将分组要求拆分为硬约束与软约束，采用“市级队先随机落位、县级队按约束紧度逐步放置”的随机启发式算法。程序共搜索 500 次，得到 450 个可行方案。</w:t>
       </w:r>
     </w:p>
     <w:tbl>
@@ -360,6 +373,19 @@
         </w:tc>
       </w:tr>
     </w:tbl>
+    <w:p>
+      <w:pPr>
+        <w:spacing w:line="360" w:lineRule="auto"/>
+        <w:ind w:firstLine="420"/>
+      </w:pPr>
+      <w:r>
+        <w:rPr>
+          <w:rFonts w:ascii="Times New Roman" w:hAnsi="Times New Roman" w:eastAsia="宋体"/>
+          <w:sz w:val="22"/>
+        </w:rPr>
+        <w:t>该方案不仅完全满足全部硬约束，而且在县级队分散性和小组实力均衡性方面表现良好。</w:t>
+      </w:r>
+    </w:p>
     <w:p>
       <w:pPr>
         <w:pStyle w:val="Heading1"/>
@@ -905,6 +931,19 @@
     </w:tbl>
     <w:p>
       <w:pPr>
+        <w:spacing w:line="360" w:lineRule="auto"/>
+        <w:ind w:firstLine="420"/>
+      </w:pPr>
+      <w:r>
+        <w:rPr>
+          <w:rFonts w:ascii="Times New Roman" w:hAnsi="Times New Roman" w:eastAsia="宋体"/>
+          <w:sz w:val="22"/>
+        </w:rPr>
+        <w:t>整体方案的平均分配距离为 127.83 km，最大分配距离为 214.82 km，且不存在主场惩罚触发情形。</w:t>
+      </w:r>
+    </w:p>
+    <w:p>
+      <w:pPr>
         <w:jc w:val="center"/>
       </w:pPr>
       <w:r>
@@ -1262,7 +1301,84 @@
           <w:rFonts w:ascii="Times New Roman" w:hAnsi="Times New Roman" w:eastAsia="黑体"/>
           <w:sz w:val="28"/>
         </w:rPr>
-        <w:t>7 结论</w:t>
+        <w:t>7 模型改进与深化</w:t>
+      </w:r>
+    </w:p>
+    <w:p>
+      <w:pPr>
+        <w:pStyle w:val="ListBullet"/>
+        <w:spacing w:line="360" w:lineRule="auto"/>
+      </w:pPr>
+      <w:r>
+        <w:rPr>
+          <w:rFonts w:ascii="Times New Roman" w:hAnsi="Times New Roman" w:eastAsia="宋体"/>
+          <w:sz w:val="22"/>
+        </w:rPr>
+        <w:t>将问题 1 从单一可行性搜索提升为多方案生成与多指标排序。</w:t>
+      </w:r>
+    </w:p>
+    <w:p>
+      <w:pPr>
+        <w:pStyle w:val="ListBullet"/>
+        <w:spacing w:line="360" w:lineRule="auto"/>
+      </w:pPr>
+      <w:r>
+        <w:rPr>
+          <w:rFonts w:ascii="Times New Roman" w:hAnsi="Times New Roman" w:eastAsia="宋体"/>
+          <w:sz w:val="22"/>
+        </w:rPr>
+        <w:t>将问题 2 从规则描述提升为统计公平性检验。</w:t>
+      </w:r>
+    </w:p>
+    <w:p>
+      <w:pPr>
+        <w:pStyle w:val="ListBullet"/>
+        <w:spacing w:line="360" w:lineRule="auto"/>
+      </w:pPr>
+      <w:r>
+        <w:rPr>
+          <w:rFonts w:ascii="Times New Roman" w:hAnsi="Times New Roman" w:eastAsia="宋体"/>
+          <w:sz w:val="22"/>
+        </w:rPr>
+        <w:t>将问题 3 从单一距离优化提升为多目标离散设施选址。</w:t>
+      </w:r>
+    </w:p>
+    <w:p>
+      <w:pPr>
+        <w:pStyle w:val="ListBullet"/>
+        <w:spacing w:line="360" w:lineRule="auto"/>
+      </w:pPr>
+      <w:r>
+        <w:rPr>
+          <w:rFonts w:ascii="Times New Roman" w:hAnsi="Times New Roman" w:eastAsia="宋体"/>
+          <w:sz w:val="22"/>
+        </w:rPr>
+        <w:t>将问题 4 从静态赛制比较提升为带疲劳传递的动态仿真。</w:t>
+      </w:r>
+    </w:p>
+    <w:p>
+      <w:pPr>
+        <w:pStyle w:val="ListBullet"/>
+        <w:spacing w:line="360" w:lineRule="auto"/>
+      </w:pPr>
+      <w:r>
+        <w:rPr>
+          <w:rFonts w:ascii="Times New Roman" w:hAnsi="Times New Roman" w:eastAsia="宋体"/>
+          <w:sz w:val="22"/>
+        </w:rPr>
+        <w:t>对问题 3 和问题 4 的关键权重与参数进行了敏感性分析。</w:t>
+      </w:r>
+    </w:p>
+    <w:p>
+      <w:pPr>
+        <w:pStyle w:val="Heading1"/>
+      </w:pPr>
+      <w:r>
+        <w:rPr>
+          <w:rFonts w:ascii="Times New Roman" w:hAnsi="Times New Roman" w:eastAsia="黑体"/>
+          <w:sz w:val="28"/>
+        </w:rPr>
+        <w:t>8 结论</w:t>
       </w:r>
     </w:p>
     <w:p>
@@ -1315,6 +1431,96 @@
           <w:sz w:val="22"/>
         </w:rPr>
         <w:t>推荐采用“小组第一对小组第二 + 后续复排”的 seeded_reseeded 赛制。</w:t>
+      </w:r>
+    </w:p>
+    <w:p>
+      <w:pPr>
+        <w:pStyle w:val="Heading1"/>
+      </w:pPr>
+      <w:r>
+        <w:rPr>
+          <w:rFonts w:ascii="Times New Roman" w:hAnsi="Times New Roman" w:eastAsia="黑体"/>
+          <w:sz w:val="28"/>
+        </w:rPr>
+        <w:t>9 附录与支撑材料说明</w:t>
+      </w:r>
+    </w:p>
+    <w:p>
+      <w:pPr>
+        <w:spacing w:line="360" w:lineRule="auto"/>
+        <w:ind w:firstLine="420"/>
+      </w:pPr>
+      <w:r>
+        <w:rPr>
+          <w:rFonts w:ascii="Times New Roman" w:hAnsi="Times New Roman" w:eastAsia="宋体"/>
+          <w:sz w:val="22"/>
+        </w:rPr>
+        <w:t>根据竞赛要求，论文附录与支撑材料应完整包含全部可运行源程序、实际使用的软件名称和命令、自主查阅使用的数据与资料，而不应重复放入赛题已直接提供的数据文件。</w:t>
+      </w:r>
+    </w:p>
+    <w:p>
+      <w:pPr>
+        <w:pStyle w:val="ListBullet"/>
+        <w:spacing w:line="360" w:lineRule="auto"/>
+      </w:pPr>
+      <w:r>
+        <w:rPr>
+          <w:rFonts w:ascii="Times New Roman" w:hAnsi="Times New Roman" w:eastAsia="宋体"/>
+          <w:sz w:val="22"/>
+        </w:rPr>
+        <w:t>源程序代码：src/problem1、src/problem2、src/problem34 下的全部 Python 文件。</w:t>
+      </w:r>
+    </w:p>
+    <w:p>
+      <w:pPr>
+        <w:pStyle w:val="ListBullet"/>
+        <w:spacing w:line="360" w:lineRule="auto"/>
+      </w:pPr>
+      <w:r>
+        <w:rPr>
+          <w:rFonts w:ascii="Times New Roman" w:hAnsi="Times New Roman" w:eastAsia="宋体"/>
+          <w:sz w:val="22"/>
+        </w:rPr>
+        <w:t>运行脚本与命令：run_problem1.py、run_problem2.py、run_problem34.py、clean_problem3_manual_sources.py、generate_b_paper_docx.py。</w:t>
+      </w:r>
+    </w:p>
+    <w:p>
+      <w:pPr>
+        <w:pStyle w:val="ListBullet"/>
+        <w:spacing w:line="360" w:lineRule="auto"/>
+      </w:pPr>
+      <w:r>
+        <w:rPr>
+          <w:rFonts w:ascii="Times New Roman" w:hAnsi="Times New Roman" w:eastAsia="宋体"/>
+          <w:sz w:val="22"/>
+        </w:rPr>
+        <w:t>自主查阅并整理的数据：region_metrics.csv、problem3_missing_fields_lookup.csv 及人工收集的 Excel 数据源。</w:t>
+      </w:r>
+    </w:p>
+    <w:p>
+      <w:pPr>
+        <w:pStyle w:val="ListBullet"/>
+        <w:spacing w:line="360" w:lineRule="auto"/>
+      </w:pPr>
+      <w:r>
+        <w:rPr>
+          <w:rFonts w:ascii="Times New Roman" w:hAnsi="Times New Roman" w:eastAsia="宋体"/>
+          <w:sz w:val="22"/>
+        </w:rPr>
+        <w:t>结果支撑文件：problem1、problem2、problem34 对应的关键 csv、txt 与 png 输出文件。</w:t>
+      </w:r>
+    </w:p>
+    <w:p>
+      <w:pPr>
+        <w:pStyle w:val="ListBullet"/>
+        <w:spacing w:line="360" w:lineRule="auto"/>
+      </w:pPr>
+      <w:r>
+        <w:rPr>
+          <w:rFonts w:ascii="Times New Roman" w:hAnsi="Times New Roman" w:eastAsia="宋体"/>
+          <w:sz w:val="22"/>
+        </w:rPr>
+        <w:t>AI 使用说明：docs/AI工具使用说明.md。</w:t>
       </w:r>
     </w:p>
     <w:p>

</xml_diff>

<commit_message>
Update paper wording and add support package
</commit_message>
<xml_diff>
--- a/docs/B题论文终稿.docx
+++ b/docs/B题论文终稿.docx
@@ -1455,7 +1455,7 @@
           <w:rFonts w:ascii="Times New Roman" w:hAnsi="Times New Roman" w:eastAsia="宋体"/>
           <w:sz w:val="22"/>
         </w:rPr>
-        <w:t>根据竞赛要求，论文附录与支撑材料应完整包含全部可运行源程序、实际使用的软件名称和命令、自主查阅使用的数据与资料，而不应重复放入赛题已直接提供的数据文件。</w:t>
+        <w:t>按照竞赛要求，本文正文之外另附完整支撑材料，以保证论文结论的可复核性、程序结果的可复现性和数据来源的可追溯性。本文支撑材料由源程序代码、运行命令、自主查阅并整理的数据资料、关键结果输出文件和 AI 工具使用说明五部分构成。</w:t>
       </w:r>
     </w:p>
     <w:p>
@@ -1468,7 +1468,7 @@
           <w:rFonts w:ascii="Times New Roman" w:hAnsi="Times New Roman" w:eastAsia="宋体"/>
           <w:sz w:val="22"/>
         </w:rPr>
-        <w:t>源程序代码：src/problem1、src/problem2、src/problem34 下的全部 Python 文件。</w:t>
+        <w:t>源程序代码包括 src/problem1、src/problem2、src/problem34 下的全部 Python 文件。</w:t>
       </w:r>
     </w:p>
     <w:p>
@@ -1481,7 +1481,7 @@
           <w:rFonts w:ascii="Times New Roman" w:hAnsi="Times New Roman" w:eastAsia="宋体"/>
           <w:sz w:val="22"/>
         </w:rPr>
-        <w:t>运行脚本与命令：run_problem1.py、run_problem2.py、run_problem34.py、clean_problem3_manual_sources.py、generate_b_paper_docx.py。</w:t>
+        <w:t>运行脚本与命令包括 run_problem1.py、run_problem2.py、run_problem34.py、clean_problem3_manual_sources.py 和 generate_b_paper_docx.py。</w:t>
       </w:r>
     </w:p>
     <w:p>
@@ -1494,7 +1494,7 @@
           <w:rFonts w:ascii="Times New Roman" w:hAnsi="Times New Roman" w:eastAsia="宋体"/>
           <w:sz w:val="22"/>
         </w:rPr>
-        <w:t>自主查阅并整理的数据：region_metrics.csv、problem3_missing_fields_lookup.csv 及人工收集的 Excel 数据源。</w:t>
+        <w:t>自主查阅并整理的数据包括 region_metrics.csv、problem3_missing_fields_lookup.csv 及人工收集的 Excel 数据源。</w:t>
       </w:r>
     </w:p>
     <w:p>
@@ -1507,7 +1507,7 @@
           <w:rFonts w:ascii="Times New Roman" w:hAnsi="Times New Roman" w:eastAsia="宋体"/>
           <w:sz w:val="22"/>
         </w:rPr>
-        <w:t>结果支撑文件：problem1、problem2、problem34 对应的关键 csv、txt 与 png 输出文件。</w:t>
+        <w:t>结果支撑文件包括 problem1、problem2、problem34 对应的关键 csv、txt 与 png 输出文件。</w:t>
       </w:r>
     </w:p>
     <w:p>
@@ -1520,7 +1520,7 @@
           <w:rFonts w:ascii="Times New Roman" w:hAnsi="Times New Roman" w:eastAsia="宋体"/>
           <w:sz w:val="22"/>
         </w:rPr>
-        <w:t>AI 使用说明：docs/AI工具使用说明.md。</w:t>
+        <w:t>AI 工具使用说明单独整理为 docs/AI工具使用说明.md。</w:t>
       </w:r>
     </w:p>
     <w:p>

</xml_diff>